<commit_message>
fix [worksheet - g1 - w8]
</commit_message>
<xml_diff>
--- a/1-G-1/8-week-8/4-worksheet/Computer Worksheet G1 W8 (Answer).docx
+++ b/1-G-1/8-week-8/4-worksheet/Computer Worksheet G1 W8 (Answer).docx
@@ -292,7 +292,7 @@
             <w:pPr>
               <w:jc w:val="center"/>
               <w:rPr>
-                <w:rFonts w:ascii="Comic Sans MS" w:hAnsi="Comic Sans MS"/>
+                <w:rFonts w:ascii="Comic Sans MS" w:hAnsi="Comic Sans MS" w:hint="cs"/>
                 <w:b/>
                 <w:bCs/>
                 <w:sz w:val="28"/>
@@ -309,7 +309,7 @@
                 <w:sz w:val="28"/>
                 <w:szCs w:val="28"/>
               </w:rPr>
-              <w:t>Need of Computers</w:t>
+              <w:t>Click with Mouse</w:t>
             </w:r>
           </w:p>
         </w:tc>
@@ -396,29 +396,7 @@
           <w:sz w:val="36"/>
           <w:szCs w:val="36"/>
         </w:rPr>
-        <w:t xml:space="preserve">heet No. </w:t>
-      </w:r>
-      <w:proofErr w:type="gramStart"/>
-      <w:r>
-        <w:rPr>
-          <w:rFonts w:ascii="Lucida Bright" w:hAnsi="Lucida Bright"/>
-          <w:b/>
-          <w:bCs/>
-          <w:sz w:val="36"/>
-          <w:szCs w:val="36"/>
-        </w:rPr>
-        <w:t xml:space="preserve">(  </w:t>
-      </w:r>
-      <w:proofErr w:type="gramEnd"/>
-      <w:r>
-        <w:rPr>
-          <w:rFonts w:ascii="Lucida Bright" w:hAnsi="Lucida Bright"/>
-          <w:b/>
-          <w:bCs/>
-          <w:sz w:val="36"/>
-          <w:szCs w:val="36"/>
-        </w:rPr>
-        <w:t xml:space="preserve">  </w:t>
+        <w:t xml:space="preserve">heet No. (    </w:t>
       </w:r>
       <w:r>
         <w:rPr>
@@ -438,20 +416,8 @@
           <w:sz w:val="36"/>
           <w:szCs w:val="36"/>
         </w:rPr>
-        <w:t xml:space="preserve"> </w:t>
+        <w:t xml:space="preserve">   )</w:t>
       </w:r>
-      <w:proofErr w:type="gramStart"/>
-      <w:r>
-        <w:rPr>
-          <w:rFonts w:ascii="Lucida Bright" w:hAnsi="Lucida Bright"/>
-          <w:b/>
-          <w:bCs/>
-          <w:sz w:val="36"/>
-          <w:szCs w:val="36"/>
-        </w:rPr>
-        <w:t xml:space="preserve">  )</w:t>
-      </w:r>
-      <w:proofErr w:type="gramEnd"/>
       <w:r>
         <w:rPr>
           <w:rFonts w:ascii="Lucida Bright" w:hAnsi="Lucida Bright"/>
@@ -531,7 +497,7 @@
           <w:szCs w:val="36"/>
         </w:rPr>
         <w:drawing>
-          <wp:anchor distT="0" distB="0" distL="114300" distR="114300" simplePos="0" relativeHeight="251624960" behindDoc="0" locked="0" layoutInCell="1" allowOverlap="1" wp14:anchorId="60A0A416" wp14:editId="222B3B0E">
+          <wp:anchor distT="0" distB="0" distL="114300" distR="114300" simplePos="0" relativeHeight="251624960" behindDoc="0" locked="0" layoutInCell="1" allowOverlap="1" wp14:anchorId="60A0A416" wp14:editId="147FBEB1">
             <wp:simplePos x="0" y="0"/>
             <wp:positionH relativeFrom="column">
               <wp:posOffset>3254168</wp:posOffset>
@@ -1143,7 +1109,7 @@
           </mc:Choice>
           <mc:Fallback>
             <w:pict>
-              <v:line w14:anchorId="01FBC8D4" id="Straight Connector 9" o:spid="_x0000_s1026" style="position:absolute;left:0;text-align:left;z-index:251612672;visibility:visible;mso-wrap-style:square;mso-wrap-distance-left:9pt;mso-wrap-distance-top:0;mso-wrap-distance-right:9pt;mso-wrap-distance-bottom:0;mso-position-horizontal:absolute;mso-position-horizontal-relative:text;mso-position-vertical:absolute;mso-position-vertical-relative:text" from="42.2pt,235.85pt" to="175.05pt,235.85pt" o:gfxdata="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" strokecolor="black [3200]" strokeweight="3pt">
+              <v:line w14:anchorId="02665965" id="Straight Connector 9" o:spid="_x0000_s1026" style="position:absolute;left:0;text-align:left;z-index:251612672;visibility:visible;mso-wrap-style:square;mso-wrap-distance-left:9pt;mso-wrap-distance-top:0;mso-wrap-distance-right:9pt;mso-wrap-distance-bottom:0;mso-position-horizontal:absolute;mso-position-horizontal-relative:text;mso-position-vertical:absolute;mso-position-vertical-relative:text" from="42.2pt,235.85pt" to="175.05pt,235.85pt" o:gfxdata="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" strokecolor="black [3200]" strokeweight="3pt">
                 <v:shadow on="t" color="black" opacity="22937f" origin=",.5" offset="0,.63889mm"/>
               </v:line>
             </w:pict>
@@ -1209,7 +1175,7 @@
           </mc:Choice>
           <mc:Fallback>
             <w:pict>
-              <v:line w14:anchorId="34ACEB3A" id="Straight Connector 9" o:spid="_x0000_s1026" style="position:absolute;left:0;text-align:left;z-index:251621888;visibility:visible;mso-wrap-style:square;mso-wrap-distance-left:9pt;mso-wrap-distance-top:0;mso-wrap-distance-right:9pt;mso-wrap-distance-bottom:0;mso-position-horizontal:absolute;mso-position-horizontal-relative:text;mso-position-vertical:absolute;mso-position-vertical-relative:text" from="362.55pt,235.95pt" to="495.4pt,235.95pt" o:gfxdata="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" strokecolor="black [3200]" strokeweight="3pt">
+              <v:line w14:anchorId="67628B91" id="Straight Connector 9" o:spid="_x0000_s1026" style="position:absolute;left:0;text-align:left;z-index:251621888;visibility:visible;mso-wrap-style:square;mso-wrap-distance-left:9pt;mso-wrap-distance-top:0;mso-wrap-distance-right:9pt;mso-wrap-distance-bottom:0;mso-position-horizontal:absolute;mso-position-horizontal-relative:text;mso-position-vertical:absolute;mso-position-vertical-relative:text" from="362.55pt,235.95pt" to="495.4pt,235.95pt" o:gfxdata="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" strokecolor="black [3200]" strokeweight="3pt">
                 <v:shadow on="t" color="black" opacity="22937f" origin=",.5" offset="0,.63889mm"/>
               </v:line>
             </w:pict>
@@ -1275,7 +1241,7 @@
           </mc:Choice>
           <mc:Fallback>
             <w:pict>
-              <v:line w14:anchorId="2999D1DA" id="Straight Connector 9" o:spid="_x0000_s1026" style="position:absolute;left:0;text-align:left;z-index:251618816;visibility:visible;mso-wrap-style:square;mso-wrap-distance-left:9pt;mso-wrap-distance-top:0;mso-wrap-distance-right:9pt;mso-wrap-distance-bottom:0;mso-position-horizontal:absolute;mso-position-horizontal-relative:text;mso-position-vertical:absolute;mso-position-vertical-relative:text" from="362.8pt,403.5pt" to="495.65pt,403.5pt" o:gfxdata="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" strokecolor="black [3200]" strokeweight="3pt">
+              <v:line w14:anchorId="4F2E1767" id="Straight Connector 9" o:spid="_x0000_s1026" style="position:absolute;left:0;text-align:left;z-index:251618816;visibility:visible;mso-wrap-style:square;mso-wrap-distance-left:9pt;mso-wrap-distance-top:0;mso-wrap-distance-right:9pt;mso-wrap-distance-bottom:0;mso-position-horizontal:absolute;mso-position-horizontal-relative:text;mso-position-vertical:absolute;mso-position-vertical-relative:text" from="362.8pt,403.5pt" to="495.65pt,403.5pt" o:gfxdata="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" strokecolor="black [3200]" strokeweight="3pt">
                 <v:shadow on="t" color="black" opacity="22937f" origin=",.5" offset="0,.63889mm"/>
               </v:line>
             </w:pict>
@@ -1341,7 +1307,7 @@
           </mc:Choice>
           <mc:Fallback>
             <w:pict>
-              <v:line w14:anchorId="02F2428A" id="Straight Connector 9" o:spid="_x0000_s1026" style="position:absolute;left:0;text-align:left;z-index:251615744;visibility:visible;mso-wrap-style:square;mso-wrap-distance-left:9pt;mso-wrap-distance-top:0;mso-wrap-distance-right:9pt;mso-wrap-distance-bottom:0;mso-position-horizontal:absolute;mso-position-horizontal-relative:text;mso-position-vertical:absolute;mso-position-vertical-relative:text" from="47.35pt,403.5pt" to="180.2pt,403.5pt" o:gfxdata="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" strokecolor="black [3200]" strokeweight="3pt">
+              <v:line w14:anchorId="3D860B74" id="Straight Connector 9" o:spid="_x0000_s1026" style="position:absolute;left:0;text-align:left;z-index:251615744;visibility:visible;mso-wrap-style:square;mso-wrap-distance-left:9pt;mso-wrap-distance-top:0;mso-wrap-distance-right:9pt;mso-wrap-distance-bottom:0;mso-position-horizontal:absolute;mso-position-horizontal-relative:text;mso-position-vertical:absolute;mso-position-vertical-relative:text" from="47.35pt,403.5pt" to="180.2pt,403.5pt" o:gfxdata="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" strokecolor="black [3200]" strokeweight="3pt">
                 <v:shadow on="t" color="black" opacity="22937f" origin=",.5" offset="0,.63889mm"/>
               </v:line>
             </w:pict>
@@ -2812,7 +2778,6 @@
   <w:style w:type="character" w:default="1" w:styleId="DefaultParagraphFont">
     <w:name w:val="Default Paragraph Font"/>
     <w:uiPriority w:val="1"/>
-    <w:semiHidden/>
     <w:unhideWhenUsed/>
   </w:style>
   <w:style w:type="table" w:default="1" w:styleId="TableNormal">

</xml_diff>